<commit_message>
Replace Calque with Bobr Translate in sample.docx text
</commit_message>
<xml_diff>
--- a/sample.docx
+++ b/sample.docx
@@ -23,7 +23,7 @@
           <w:b/>
           <w:color w:val="216EF3"/>
         </w:rPr>
-        <w:t>Calque</w:t>
+        <w:t>Bobr Translate</w:t>
       </w:r>
       <w:r>
         <w:rPr>
@@ -308,7 +308,7 @@
           <w:color w:val="808080"/>
           <w:sz w:val="20"/>
         </w:rPr>
-        <w:t>End of document — feel free to translate this file with Calque.</w:t>
+        <w:t>End of document — feel free to translate this file with Bobr Translate.</w:t>
       </w:r>
     </w:p>
     <w:sectPr>

</xml_diff>